<commit_message>
Include menu prices in barcode catalog
</commit_message>
<xml_diff>
--- a/Vedrix_POS_SSCS_Barcodes.docx
+++ b/Vedrix_POS_SSCS_Barcodes.docx
@@ -82,7 +82,7 @@
                 <w:sz w:val="15"/>
                 <w:szCs w:val="15"/>
               </w:rPr>
-              <w:t xml:space="preserve">Krunch Box Bone-In</w:t>
+              <w:t xml:space="preserve">Krunch Box Bone-In • $8.09</w:t>
             </w:r>
           </w:p>
           <w:p>
@@ -187,7 +187,7 @@
                 <w:sz w:val="15"/>
                 <w:szCs w:val="15"/>
               </w:rPr>
-              <w:t xml:space="preserve">Krunch Box Bone-In</w:t>
+              <w:t xml:space="preserve">Krunch Box Bone-In • $9.59</w:t>
             </w:r>
           </w:p>
           <w:p>
@@ -294,7 +294,7 @@
                 <w:sz w:val="15"/>
                 <w:szCs w:val="15"/>
               </w:rPr>
-              <w:t xml:space="preserve">Krunch Box Bone-In</w:t>
+              <w:t xml:space="preserve">Krunch Box Bone-In • $11.09</w:t>
             </w:r>
           </w:p>
           <w:p>
@@ -399,7 +399,7 @@
                 <w:sz w:val="15"/>
                 <w:szCs w:val="15"/>
               </w:rPr>
-              <w:t xml:space="preserve">Chicken &amp; Biscuit</w:t>
+              <w:t xml:space="preserve">Chicken &amp; Biscuit • $6.19</w:t>
             </w:r>
           </w:p>
           <w:p>
@@ -506,7 +506,7 @@
                 <w:sz w:val="15"/>
                 <w:szCs w:val="15"/>
               </w:rPr>
-              <w:t xml:space="preserve">Chicken &amp; Biscuit</w:t>
+              <w:t xml:space="preserve">Chicken &amp; Biscuit • $8.09</w:t>
             </w:r>
           </w:p>
           <w:p>
@@ -611,7 +611,7 @@
                 <w:sz w:val="15"/>
                 <w:szCs w:val="15"/>
               </w:rPr>
-              <w:t xml:space="preserve">Chicken &amp; Biscuit</w:t>
+              <w:t xml:space="preserve">Chicken &amp; Biscuit • $10.09</w:t>
             </w:r>
           </w:p>
           <w:p>
@@ -718,7 +718,7 @@
                 <w:sz w:val="15"/>
                 <w:szCs w:val="15"/>
               </w:rPr>
-              <w:t xml:space="preserve">Krunch Box Tenders</w:t>
+              <w:t xml:space="preserve">Krunch Box Tenders • $8.49</w:t>
             </w:r>
           </w:p>
           <w:p>
@@ -823,7 +823,7 @@
                 <w:sz w:val="15"/>
                 <w:szCs w:val="15"/>
               </w:rPr>
-              <w:t xml:space="preserve">Krunch Box Tenders</w:t>
+              <w:t xml:space="preserve">Krunch Box Tenders • $10.49</w:t>
             </w:r>
           </w:p>
           <w:p>
@@ -930,7 +930,7 @@
                 <w:sz w:val="15"/>
                 <w:szCs w:val="15"/>
               </w:rPr>
-              <w:t xml:space="preserve">Krunch Box Tenders</w:t>
+              <w:t xml:space="preserve">Krunch Box Tenders • $13.49</w:t>
             </w:r>
           </w:p>
           <w:p>
@@ -1035,7 +1035,7 @@
                 <w:sz w:val="15"/>
                 <w:szCs w:val="15"/>
               </w:rPr>
-              <w:t xml:space="preserve">Tender &amp; Biscuit</w:t>
+              <w:t xml:space="preserve">Tender &amp; Biscuit • $7.49</w:t>
             </w:r>
           </w:p>
           <w:p>
@@ -1142,7 +1142,7 @@
                 <w:sz w:val="15"/>
                 <w:szCs w:val="15"/>
               </w:rPr>
-              <w:t xml:space="preserve">Tender &amp; Biscuit</w:t>
+              <w:t xml:space="preserve">Tender &amp; Biscuit • $8.99</w:t>
             </w:r>
           </w:p>
           <w:p>
@@ -1247,7 +1247,7 @@
                 <w:sz w:val="15"/>
                 <w:szCs w:val="15"/>
               </w:rPr>
-              <w:t xml:space="preserve">Tender &amp; Biscuit</w:t>
+              <w:t xml:space="preserve">Tender &amp; Biscuit • $11.49</w:t>
             </w:r>
           </w:p>
           <w:p>
@@ -1354,7 +1354,7 @@
                 <w:sz w:val="15"/>
                 <w:szCs w:val="15"/>
               </w:rPr>
-              <w:t xml:space="preserve">Wings</w:t>
+              <w:t xml:space="preserve">Wings • $7.99</w:t>
             </w:r>
           </w:p>
           <w:p>
@@ -1459,7 +1459,7 @@
                 <w:sz w:val="15"/>
                 <w:szCs w:val="15"/>
               </w:rPr>
-              <w:t xml:space="preserve">Wings</w:t>
+              <w:t xml:space="preserve">Wings • $14.99</w:t>
             </w:r>
           </w:p>
           <w:p>
@@ -1566,7 +1566,7 @@
                 <w:sz w:val="15"/>
                 <w:szCs w:val="15"/>
               </w:rPr>
-              <w:t xml:space="preserve">Wings</w:t>
+              <w:t xml:space="preserve">Wings • $24.99</w:t>
             </w:r>
           </w:p>
           <w:p>
@@ -1671,7 +1671,7 @@
                 <w:sz w:val="15"/>
                 <w:szCs w:val="15"/>
               </w:rPr>
-              <w:t xml:space="preserve">Shrimp</w:t>
+              <w:t xml:space="preserve">Shrimp • $4.99</w:t>
             </w:r>
           </w:p>
           <w:p>
@@ -1778,7 +1778,7 @@
                 <w:sz w:val="15"/>
                 <w:szCs w:val="15"/>
               </w:rPr>
-              <w:t xml:space="preserve">Shrimp</w:t>
+              <w:t xml:space="preserve">Shrimp • $7.99</w:t>
             </w:r>
           </w:p>
           <w:p>
@@ -1883,7 +1883,7 @@
                 <w:sz w:val="15"/>
                 <w:szCs w:val="15"/>
               </w:rPr>
-              <w:t xml:space="preserve">Sandwiches</w:t>
+              <w:t xml:space="preserve">Sandwiches • $4.99</w:t>
             </w:r>
           </w:p>
           <w:p>
@@ -1990,7 +1990,7 @@
                 <w:sz w:val="15"/>
                 <w:szCs w:val="15"/>
               </w:rPr>
-              <w:t xml:space="preserve">Sandwiches</w:t>
+              <w:t xml:space="preserve">Sandwiches • $6.99</w:t>
             </w:r>
           </w:p>
           <w:p>
@@ -2095,7 +2095,7 @@
                 <w:sz w:val="15"/>
                 <w:szCs w:val="15"/>
               </w:rPr>
-              <w:t xml:space="preserve">Family Meals</w:t>
+              <w:t xml:space="preserve">Family Meals • $42.99</w:t>
             </w:r>
           </w:p>
           <w:p>
@@ -2202,7 +2202,7 @@
                 <w:sz w:val="15"/>
                 <w:szCs w:val="15"/>
               </w:rPr>
-              <w:t xml:space="preserve">Family Meals</w:t>
+              <w:t xml:space="preserve">Family Meals • $32.99</w:t>
             </w:r>
           </w:p>
           <w:p>
@@ -2307,7 +2307,7 @@
                 <w:sz w:val="15"/>
                 <w:szCs w:val="15"/>
               </w:rPr>
-              <w:t xml:space="preserve">Family Meals</w:t>
+              <w:t xml:space="preserve">Family Meals • $29.99</w:t>
             </w:r>
           </w:p>
           <w:p>
@@ -2414,7 +2414,7 @@
                 <w:sz w:val="15"/>
                 <w:szCs w:val="15"/>
               </w:rPr>
-              <w:t xml:space="preserve">Biscuits</w:t>
+              <w:t xml:space="preserve">Biscuits • $0.99</w:t>
             </w:r>
           </w:p>
           <w:p>
@@ -2519,7 +2519,7 @@
                 <w:sz w:val="15"/>
                 <w:szCs w:val="15"/>
               </w:rPr>
-              <w:t xml:space="preserve">Biscuits</w:t>
+              <w:t xml:space="preserve">Biscuits • $1.79</w:t>
             </w:r>
           </w:p>
           <w:p>
@@ -2626,7 +2626,7 @@
                 <w:sz w:val="15"/>
                 <w:szCs w:val="15"/>
               </w:rPr>
-              <w:t xml:space="preserve">Biscuits</w:t>
+              <w:t xml:space="preserve">Biscuits • $4.59</w:t>
             </w:r>
           </w:p>
           <w:p>
@@ -2731,7 +2731,7 @@
                 <w:sz w:val="15"/>
                 <w:szCs w:val="15"/>
               </w:rPr>
-              <w:t xml:space="preserve">Sides</w:t>
+              <w:t xml:space="preserve">Sides • $2.49</w:t>
             </w:r>
           </w:p>
           <w:p>
@@ -2838,7 +2838,7 @@
                 <w:sz w:val="15"/>
                 <w:szCs w:val="15"/>
               </w:rPr>
-              <w:t xml:space="preserve">Sides</w:t>
+              <w:t xml:space="preserve">Sides • $3.99</w:t>
             </w:r>
           </w:p>
           <w:p>
@@ -2943,7 +2943,7 @@
                 <w:sz w:val="15"/>
                 <w:szCs w:val="15"/>
               </w:rPr>
-              <w:t xml:space="preserve">Sides</w:t>
+              <w:t xml:space="preserve">Sides • $5.49</w:t>
             </w:r>
           </w:p>
           <w:p>
@@ -3050,7 +3050,7 @@
                 <w:sz w:val="15"/>
                 <w:szCs w:val="15"/>
               </w:rPr>
-              <w:t xml:space="preserve">Sides</w:t>
+              <w:t xml:space="preserve">Sides • $2.59</w:t>
             </w:r>
           </w:p>
           <w:p>
@@ -3155,7 +3155,7 @@
                 <w:sz w:val="15"/>
                 <w:szCs w:val="15"/>
               </w:rPr>
-              <w:t xml:space="preserve">Sides</w:t>
+              <w:t xml:space="preserve">Sides • $4.59</w:t>
             </w:r>
           </w:p>
           <w:p>
@@ -3262,7 +3262,7 @@
                 <w:sz w:val="15"/>
                 <w:szCs w:val="15"/>
               </w:rPr>
-              <w:t xml:space="preserve">Sides</w:t>
+              <w:t xml:space="preserve">Sides • $2.59</w:t>
             </w:r>
           </w:p>
           <w:p>
@@ -3367,7 +3367,7 @@
                 <w:sz w:val="15"/>
                 <w:szCs w:val="15"/>
               </w:rPr>
-              <w:t xml:space="preserve">Sides</w:t>
+              <w:t xml:space="preserve">Sides • $4.59</w:t>
             </w:r>
           </w:p>
           <w:p>
@@ -3474,7 +3474,7 @@
                 <w:sz w:val="15"/>
                 <w:szCs w:val="15"/>
               </w:rPr>
-              <w:t xml:space="preserve">Sides</w:t>
+              <w:t xml:space="preserve">Sides • $2.59</w:t>
             </w:r>
           </w:p>
           <w:p>
@@ -3579,7 +3579,7 @@
                 <w:sz w:val="15"/>
                 <w:szCs w:val="15"/>
               </w:rPr>
-              <w:t xml:space="preserve">Sides</w:t>
+              <w:t xml:space="preserve">Sides • $4.59</w:t>
             </w:r>
           </w:p>
           <w:p>
@@ -3686,7 +3686,7 @@
                 <w:sz w:val="15"/>
                 <w:szCs w:val="15"/>
               </w:rPr>
-              <w:t xml:space="preserve">Sides</w:t>
+              <w:t xml:space="preserve">Sides • $2.59</w:t>
             </w:r>
           </w:p>
           <w:p>
@@ -3791,7 +3791,7 @@
                 <w:sz w:val="15"/>
                 <w:szCs w:val="15"/>
               </w:rPr>
-              <w:t xml:space="preserve">Sides</w:t>
+              <w:t xml:space="preserve">Sides • $4.59</w:t>
             </w:r>
           </w:p>
           <w:p>
@@ -3898,7 +3898,7 @@
                 <w:sz w:val="15"/>
                 <w:szCs w:val="15"/>
               </w:rPr>
-              <w:t xml:space="preserve">A La Carte</w:t>
+              <w:t xml:space="preserve">A La Carte • $2.59</w:t>
             </w:r>
           </w:p>
           <w:p>
@@ -4003,7 +4003,7 @@
                 <w:sz w:val="15"/>
                 <w:szCs w:val="15"/>
               </w:rPr>
-              <w:t xml:space="preserve">A La Carte</w:t>
+              <w:t xml:space="preserve">A La Carte • $2.59</w:t>
             </w:r>
           </w:p>
           <w:p>
@@ -4110,7 +4110,7 @@
                 <w:sz w:val="15"/>
                 <w:szCs w:val="15"/>
               </w:rPr>
-              <w:t xml:space="preserve">A La Carte</w:t>
+              <w:t xml:space="preserve">A La Carte • $2.29</w:t>
             </w:r>
           </w:p>
           <w:p>
@@ -4215,7 +4215,7 @@
                 <w:sz w:val="15"/>
                 <w:szCs w:val="15"/>
               </w:rPr>
-              <w:t xml:space="preserve">A La Carte</w:t>
+              <w:t xml:space="preserve">A La Carte • $2.29</w:t>
             </w:r>
           </w:p>
           <w:p>
@@ -4322,7 +4322,7 @@
                 <w:sz w:val="15"/>
                 <w:szCs w:val="15"/>
               </w:rPr>
-              <w:t xml:space="preserve">Only Chicken</w:t>
+              <w:t xml:space="preserve">Only Chicken • $16.99</w:t>
             </w:r>
           </w:p>
           <w:p>
@@ -4427,7 +4427,7 @@
                 <w:sz w:val="15"/>
                 <w:szCs w:val="15"/>
               </w:rPr>
-              <w:t xml:space="preserve">Only Chicken</w:t>
+              <w:t xml:space="preserve">Only Chicken • $24.99</w:t>
             </w:r>
           </w:p>
           <w:p>
@@ -4534,7 +4534,7 @@
                 <w:sz w:val="15"/>
                 <w:szCs w:val="15"/>
               </w:rPr>
-              <w:t xml:space="preserve">Only Chicken</w:t>
+              <w:t xml:space="preserve">Only Chicken • $32.99</w:t>
             </w:r>
           </w:p>
           <w:p>
@@ -4639,7 +4639,7 @@
                 <w:sz w:val="15"/>
                 <w:szCs w:val="15"/>
               </w:rPr>
-              <w:t xml:space="preserve">Only Tenders</w:t>
+              <w:t xml:space="preserve">Only Tenders • $15.99</w:t>
             </w:r>
           </w:p>
           <w:p>
@@ -4746,7 +4746,7 @@
                 <w:sz w:val="15"/>
                 <w:szCs w:val="15"/>
               </w:rPr>
-              <w:t xml:space="preserve">Only Tenders</w:t>
+              <w:t xml:space="preserve">Only Tenders • $23.99</w:t>
             </w:r>
           </w:p>
           <w:p>
@@ -4851,7 +4851,7 @@
                 <w:sz w:val="15"/>
                 <w:szCs w:val="15"/>
               </w:rPr>
-              <w:t xml:space="preserve">Only Tenders</w:t>
+              <w:t xml:space="preserve">Only Tenders • $31.99</w:t>
             </w:r>
           </w:p>
           <w:p>
@@ -4958,7 +4958,7 @@
                 <w:sz w:val="15"/>
                 <w:szCs w:val="15"/>
               </w:rPr>
-              <w:t xml:space="preserve">Nuggets</w:t>
+              <w:t xml:space="preserve">Nuggets • $5.49</w:t>
             </w:r>
           </w:p>
           <w:p>
@@ -5063,7 +5063,7 @@
                 <w:sz w:val="15"/>
                 <w:szCs w:val="15"/>
               </w:rPr>
-              <w:t xml:space="preserve">Nuggets</w:t>
+              <w:t xml:space="preserve">Nuggets • $7.49</w:t>
             </w:r>
           </w:p>
           <w:p>
@@ -5170,7 +5170,7 @@
                 <w:sz w:val="15"/>
                 <w:szCs w:val="15"/>
               </w:rPr>
-              <w:t xml:space="preserve">Nuggets</w:t>
+              <w:t xml:space="preserve">Nuggets • $6.99</w:t>
             </w:r>
           </w:p>
           <w:p>
@@ -5275,7 +5275,7 @@
                 <w:sz w:val="15"/>
                 <w:szCs w:val="15"/>
               </w:rPr>
-              <w:t xml:space="preserve">Nuggets</w:t>
+              <w:t xml:space="preserve">Nuggets • $8.99</w:t>
             </w:r>
           </w:p>
           <w:p>
@@ -5382,7 +5382,7 @@
                 <w:sz w:val="15"/>
                 <w:szCs w:val="15"/>
               </w:rPr>
-              <w:t xml:space="preserve">Nuggets</w:t>
+              <w:t xml:space="preserve">Nuggets • $4.99</w:t>
             </w:r>
           </w:p>
           <w:p>
@@ -5487,7 +5487,7 @@
                 <w:sz w:val="15"/>
                 <w:szCs w:val="15"/>
               </w:rPr>
-              <w:t xml:space="preserve">Nuggets</w:t>
+              <w:t xml:space="preserve">Nuggets • $6.99</w:t>
             </w:r>
           </w:p>
           <w:p>
@@ -5594,7 +5594,7 @@
                 <w:sz w:val="15"/>
                 <w:szCs w:val="15"/>
               </w:rPr>
-              <w:t xml:space="preserve">Misc</w:t>
+              <w:t xml:space="preserve">Misc • $1.99</w:t>
             </w:r>
           </w:p>
           <w:p>
@@ -5699,7 +5699,7 @@
                 <w:sz w:val="15"/>
                 <w:szCs w:val="15"/>
               </w:rPr>
-              <w:t xml:space="preserve">Misc</w:t>
+              <w:t xml:space="preserve">Misc • $2.19</w:t>
             </w:r>
           </w:p>
           <w:p>

</xml_diff>